<commit_message>
Unify multivariate ts_data workflow
</commit_message>
<xml_diff>
--- a/examples/augment/doc/01-no-augmentation.docx
+++ b/examples/augment/doc/01-no-augmentation.docx
@@ -369,7 +369,7 @@
               <a:graphicData uri="http://schemas.openxmlformats.org/drawingml/2006/picture">
                 <pic:pic>
                   <pic:nvPicPr>
-                    <pic:cNvPr descr="/home/gpca/tspredit/examples/augment/doc/01-no-augmentation_files/2311a3ccdefa9666c559bd154e42236a6cdf3fea.png" id="11" name="Picture"/>
+                    <pic:cNvPr descr="C:\Git\cefet-rj-dal\tspredit\examples\augment\doc\01-no-augmentation_files/716a4d1e457f97618aa46ca41f6f38e17df76816.png" id="11" name="Picture"/>
                     <pic:cNvPicPr>
                       <a:picLocks noChangeArrowheads="1" noChangeAspect="1"/>
                     </pic:cNvPicPr>
@@ -1162,7 +1162,7 @@
               <a:graphicData uri="http://schemas.openxmlformats.org/drawingml/2006/picture">
                 <pic:pic>
                   <pic:nvPicPr>
-                    <pic:cNvPr descr="/home/gpca/tspredit/examples/augment/doc/01-no-augmentation_files/947f2fb8f963975c5616e6b2b1fca57ece73565d.png" id="14" name="Picture"/>
+                    <pic:cNvPr descr="C:\Git\cefet-rj-dal\tspredit\examples\augment\doc\01-no-augmentation_files/5c57e47c56729e612b99c8d3ade80ee8433dc498.png" id="14" name="Picture"/>
                     <pic:cNvPicPr>
                       <a:picLocks noChangeArrowheads="1" noChangeAspect="1"/>
                     </pic:cNvPicPr>

</xml_diff>

<commit_message>
Update generated examples from converter run
</commit_message>
<xml_diff>
--- a/examples/augment/doc/01-no-augmentation.docx
+++ b/examples/augment/doc/01-no-augmentation.docx
@@ -369,7 +369,7 @@
               <a:graphicData uri="http://schemas.openxmlformats.org/drawingml/2006/picture">
                 <pic:pic>
                   <pic:nvPicPr>
-                    <pic:cNvPr descr="C:\Git\cefet-rj-dal\tspredit\examples\augment\doc\01-no-augmentation_files/716a4d1e457f97618aa46ca41f6f38e17df76816.png" id="11" name="Picture"/>
+                    <pic:cNvPr descr="C:\Git\dal\tspredit\examples\augment\doc\01-no-augmentation_files/716a4d1e457f97618aa46ca41f6f38e17df76816.png" id="11" name="Picture"/>
                     <pic:cNvPicPr>
                       <a:picLocks noChangeArrowheads="1" noChangeAspect="1"/>
                     </pic:cNvPicPr>
@@ -700,7 +700,7 @@
         <w:rPr>
           <w:rStyle w:val="VerbatimChar"/>
         </w:rPr>
-        <w:t xml:space="preserve">##             t9        t8        t7        t6        t5        t4        t3        t2         t1         t0</w:t>
+        <w:t xml:space="preserve">##             t9        t8        t7        t6        t5        t4        t3</w:t>
       </w:r>
       <w:r>
         <w:br/>
@@ -709,7 +709,7 @@
         <w:rPr>
           <w:rStyle w:val="VerbatimChar"/>
         </w:rPr>
-        <w:t xml:space="preserve">## [1,] 0.0000000 0.2474040 0.4794255 0.6816388 0.8414710 0.9489846 0.9974950 0.9839859  0.9092974  0.7780732</w:t>
+        <w:t xml:space="preserve">## [1,] 0.0000000 0.2474040 0.4794255 0.6816388 0.8414710 0.9489846 0.9974950</w:t>
       </w:r>
       <w:r>
         <w:br/>
@@ -718,7 +718,7 @@
         <w:rPr>
           <w:rStyle w:val="VerbatimChar"/>
         </w:rPr>
-        <w:t xml:space="preserve">## [2,] 0.2474040 0.4794255 0.6816388 0.8414710 0.9489846 0.9974950 0.9839859 0.9092974  0.7780732  0.5984721</w:t>
+        <w:t xml:space="preserve">## [2,] 0.2474040 0.4794255 0.6816388 0.8414710 0.9489846 0.9974950 0.9839859</w:t>
       </w:r>
       <w:r>
         <w:br/>
@@ -727,7 +727,7 @@
         <w:rPr>
           <w:rStyle w:val="VerbatimChar"/>
         </w:rPr>
-        <w:t xml:space="preserve">## [3,] 0.4794255 0.6816388 0.8414710 0.9489846 0.9974950 0.9839859 0.9092974 0.7780732  0.5984721  0.3816610</w:t>
+        <w:t xml:space="preserve">## [3,] 0.4794255 0.6816388 0.8414710 0.9489846 0.9974950 0.9839859 0.9092974</w:t>
       </w:r>
       <w:r>
         <w:br/>
@@ -736,7 +736,7 @@
         <w:rPr>
           <w:rStyle w:val="VerbatimChar"/>
         </w:rPr>
-        <w:t xml:space="preserve">## [4,] 0.6816388 0.8414710 0.9489846 0.9974950 0.9839859 0.9092974 0.7780732 0.5984721  0.3816610  0.1411200</w:t>
+        <w:t xml:space="preserve">## [4,] 0.6816388 0.8414710 0.9489846 0.9974950 0.9839859 0.9092974 0.7780732</w:t>
       </w:r>
       <w:r>
         <w:br/>
@@ -745,7 +745,7 @@
         <w:rPr>
           <w:rStyle w:val="VerbatimChar"/>
         </w:rPr>
-        <w:t xml:space="preserve">## [5,] 0.8414710 0.9489846 0.9974950 0.9839859 0.9092974 0.7780732 0.5984721 0.3816610  0.1411200 -0.1081951</w:t>
+        <w:t xml:space="preserve">## [5,] 0.8414710 0.9489846 0.9974950 0.9839859 0.9092974 0.7780732 0.5984721</w:t>
       </w:r>
       <w:r>
         <w:br/>
@@ -754,7 +754,70 @@
         <w:rPr>
           <w:rStyle w:val="VerbatimChar"/>
         </w:rPr>
-        <w:t xml:space="preserve">## [6,] 0.9489846 0.9974950 0.9839859 0.9092974 0.7780732 0.5984721 0.3816610 0.1411200 -0.1081951 -0.3507832</w:t>
+        <w:t xml:space="preserve">## [6,] 0.9489846 0.9974950 0.9839859 0.9092974 0.7780732 0.5984721 0.3816610</w:t>
+      </w:r>
+      <w:r>
+        <w:br/>
+      </w:r>
+      <w:r>
+        <w:rPr>
+          <w:rStyle w:val="VerbatimChar"/>
+        </w:rPr>
+        <w:t xml:space="preserve">##             t2         t1         t0</w:t>
+      </w:r>
+      <w:r>
+        <w:br/>
+      </w:r>
+      <w:r>
+        <w:rPr>
+          <w:rStyle w:val="VerbatimChar"/>
+        </w:rPr>
+        <w:t xml:space="preserve">## [1,] 0.9839859  0.9092974  0.7780732</w:t>
+      </w:r>
+      <w:r>
+        <w:br/>
+      </w:r>
+      <w:r>
+        <w:rPr>
+          <w:rStyle w:val="VerbatimChar"/>
+        </w:rPr>
+        <w:t xml:space="preserve">## [2,] 0.9092974  0.7780732  0.5984721</w:t>
+      </w:r>
+      <w:r>
+        <w:br/>
+      </w:r>
+      <w:r>
+        <w:rPr>
+          <w:rStyle w:val="VerbatimChar"/>
+        </w:rPr>
+        <w:t xml:space="preserve">## [3,] 0.7780732  0.5984721  0.3816610</w:t>
+      </w:r>
+      <w:r>
+        <w:br/>
+      </w:r>
+      <w:r>
+        <w:rPr>
+          <w:rStyle w:val="VerbatimChar"/>
+        </w:rPr>
+        <w:t xml:space="preserve">## [4,] 0.5984721  0.3816610  0.1411200</w:t>
+      </w:r>
+      <w:r>
+        <w:br/>
+      </w:r>
+      <w:r>
+        <w:rPr>
+          <w:rStyle w:val="VerbatimChar"/>
+        </w:rPr>
+        <w:t xml:space="preserve">## [5,] 0.3816610  0.1411200 -0.1081951</w:t>
+      </w:r>
+      <w:r>
+        <w:br/>
+      </w:r>
+      <w:r>
+        <w:rPr>
+          <w:rStyle w:val="VerbatimChar"/>
+        </w:rPr>
+        <w:t xml:space="preserve">## [6,] 0.1411200 -0.1081951 -0.3507832</w:t>
       </w:r>
     </w:p>
     <w:p>
@@ -1162,7 +1225,7 @@
               <a:graphicData uri="http://schemas.openxmlformats.org/drawingml/2006/picture">
                 <pic:pic>
                   <pic:nvPicPr>
-                    <pic:cNvPr descr="C:\Git\cefet-rj-dal\tspredit\examples\augment\doc\01-no-augmentation_files/5c57e47c56729e612b99c8d3ade80ee8433dc498.png" id="14" name="Picture"/>
+                    <pic:cNvPr descr="C:\Git\dal\tspredit\examples\augment\doc\01-no-augmentation_files/5c57e47c56729e612b99c8d3ade80ee8433dc498.png" id="14" name="Picture"/>
                     <pic:cNvPicPr>
                       <a:picLocks noChangeArrowheads="1" noChangeAspect="1"/>
                     </pic:cNvPicPr>

</xml_diff>

<commit_message>
Update successful generated examples
</commit_message>
<xml_diff>
--- a/examples/augment/doc/01-no-augmentation.docx
+++ b/examples/augment/doc/01-no-augmentation.docx
@@ -700,7 +700,7 @@
         <w:rPr>
           <w:rStyle w:val="VerbatimChar"/>
         </w:rPr>
-        <w:t xml:space="preserve">##             t9        t8        t7        t6        t5        t4        t3</w:t>
+        <w:t xml:space="preserve">##             t9        t8        t7        t6        t5        t4        t3        t2         t1         t0</w:t>
       </w:r>
       <w:r>
         <w:br/>
@@ -709,7 +709,7 @@
         <w:rPr>
           <w:rStyle w:val="VerbatimChar"/>
         </w:rPr>
-        <w:t xml:space="preserve">## [1,] 0.0000000 0.2474040 0.4794255 0.6816388 0.8414710 0.9489846 0.9974950</w:t>
+        <w:t xml:space="preserve">## [1,] 0.0000000 0.2474040 0.4794255 0.6816388 0.8414710 0.9489846 0.9974950 0.9839859  0.9092974  0.7780732</w:t>
       </w:r>
       <w:r>
         <w:br/>
@@ -718,7 +718,7 @@
         <w:rPr>
           <w:rStyle w:val="VerbatimChar"/>
         </w:rPr>
-        <w:t xml:space="preserve">## [2,] 0.2474040 0.4794255 0.6816388 0.8414710 0.9489846 0.9974950 0.9839859</w:t>
+        <w:t xml:space="preserve">## [2,] 0.2474040 0.4794255 0.6816388 0.8414710 0.9489846 0.9974950 0.9839859 0.9092974  0.7780732  0.5984721</w:t>
       </w:r>
       <w:r>
         <w:br/>
@@ -727,7 +727,7 @@
         <w:rPr>
           <w:rStyle w:val="VerbatimChar"/>
         </w:rPr>
-        <w:t xml:space="preserve">## [3,] 0.4794255 0.6816388 0.8414710 0.9489846 0.9974950 0.9839859 0.9092974</w:t>
+        <w:t xml:space="preserve">## [3,] 0.4794255 0.6816388 0.8414710 0.9489846 0.9974950 0.9839859 0.9092974 0.7780732  0.5984721  0.3816610</w:t>
       </w:r>
       <w:r>
         <w:br/>
@@ -736,7 +736,7 @@
         <w:rPr>
           <w:rStyle w:val="VerbatimChar"/>
         </w:rPr>
-        <w:t xml:space="preserve">## [4,] 0.6816388 0.8414710 0.9489846 0.9974950 0.9839859 0.9092974 0.7780732</w:t>
+        <w:t xml:space="preserve">## [4,] 0.6816388 0.8414710 0.9489846 0.9974950 0.9839859 0.9092974 0.7780732 0.5984721  0.3816610  0.1411200</w:t>
       </w:r>
       <w:r>
         <w:br/>
@@ -745,7 +745,7 @@
         <w:rPr>
           <w:rStyle w:val="VerbatimChar"/>
         </w:rPr>
-        <w:t xml:space="preserve">## [5,] 0.8414710 0.9489846 0.9974950 0.9839859 0.9092974 0.7780732 0.5984721</w:t>
+        <w:t xml:space="preserve">## [5,] 0.8414710 0.9489846 0.9974950 0.9839859 0.9092974 0.7780732 0.5984721 0.3816610  0.1411200 -0.1081951</w:t>
       </w:r>
       <w:r>
         <w:br/>
@@ -754,70 +754,7 @@
         <w:rPr>
           <w:rStyle w:val="VerbatimChar"/>
         </w:rPr>
-        <w:t xml:space="preserve">## [6,] 0.9489846 0.9974950 0.9839859 0.9092974 0.7780732 0.5984721 0.3816610</w:t>
-      </w:r>
-      <w:r>
-        <w:br/>
-      </w:r>
-      <w:r>
-        <w:rPr>
-          <w:rStyle w:val="VerbatimChar"/>
-        </w:rPr>
-        <w:t xml:space="preserve">##             t2         t1         t0</w:t>
-      </w:r>
-      <w:r>
-        <w:br/>
-      </w:r>
-      <w:r>
-        <w:rPr>
-          <w:rStyle w:val="VerbatimChar"/>
-        </w:rPr>
-        <w:t xml:space="preserve">## [1,] 0.9839859  0.9092974  0.7780732</w:t>
-      </w:r>
-      <w:r>
-        <w:br/>
-      </w:r>
-      <w:r>
-        <w:rPr>
-          <w:rStyle w:val="VerbatimChar"/>
-        </w:rPr>
-        <w:t xml:space="preserve">## [2,] 0.9092974  0.7780732  0.5984721</w:t>
-      </w:r>
-      <w:r>
-        <w:br/>
-      </w:r>
-      <w:r>
-        <w:rPr>
-          <w:rStyle w:val="VerbatimChar"/>
-        </w:rPr>
-        <w:t xml:space="preserve">## [3,] 0.7780732  0.5984721  0.3816610</w:t>
-      </w:r>
-      <w:r>
-        <w:br/>
-      </w:r>
-      <w:r>
-        <w:rPr>
-          <w:rStyle w:val="VerbatimChar"/>
-        </w:rPr>
-        <w:t xml:space="preserve">## [4,] 0.5984721  0.3816610  0.1411200</w:t>
-      </w:r>
-      <w:r>
-        <w:br/>
-      </w:r>
-      <w:r>
-        <w:rPr>
-          <w:rStyle w:val="VerbatimChar"/>
-        </w:rPr>
-        <w:t xml:space="preserve">## [5,] 0.3816610  0.1411200 -0.1081951</w:t>
-      </w:r>
-      <w:r>
-        <w:br/>
-      </w:r>
-      <w:r>
-        <w:rPr>
-          <w:rStyle w:val="VerbatimChar"/>
-        </w:rPr>
-        <w:t xml:space="preserve">## [6,] 0.1411200 -0.1081951 -0.3507832</w:t>
+        <w:t xml:space="preserve">## [6,] 0.9489846 0.9974950 0.9839859 0.9092974 0.7780732 0.5984721 0.3816610 0.1411200 -0.1081951 -0.3507832</w:t>
       </w:r>
     </w:p>
     <w:p>

</xml_diff>

<commit_message>
Fix time-series preprocessing contracts and refresh examples
</commit_message>
<xml_diff>
--- a/examples/augment/doc/01-no-augmentation.docx
+++ b/examples/augment/doc/01-no-augmentation.docx
@@ -700,7 +700,7 @@
         <w:rPr>
           <w:rStyle w:val="VerbatimChar"/>
         </w:rPr>
-        <w:t xml:space="preserve">##             t9        t8        t7        t6        t5        t4        t3        t2         t1         t0</w:t>
+        <w:t xml:space="preserve">##             t9        t8        t7        t6        t5        t4        t3</w:t>
       </w:r>
       <w:r>
         <w:br/>
@@ -709,7 +709,7 @@
         <w:rPr>
           <w:rStyle w:val="VerbatimChar"/>
         </w:rPr>
-        <w:t xml:space="preserve">## [1,] 0.0000000 0.2474040 0.4794255 0.6816388 0.8414710 0.9489846 0.9974950 0.9839859  0.9092974  0.7780732</w:t>
+        <w:t xml:space="preserve">## [1,] 0.0000000 0.2474040 0.4794255 0.6816388 0.8414710 0.9489846 0.9974950</w:t>
       </w:r>
       <w:r>
         <w:br/>
@@ -718,7 +718,7 @@
         <w:rPr>
           <w:rStyle w:val="VerbatimChar"/>
         </w:rPr>
-        <w:t xml:space="preserve">## [2,] 0.2474040 0.4794255 0.6816388 0.8414710 0.9489846 0.9974950 0.9839859 0.9092974  0.7780732  0.5984721</w:t>
+        <w:t xml:space="preserve">## [2,] 0.2474040 0.4794255 0.6816388 0.8414710 0.9489846 0.9974950 0.9839859</w:t>
       </w:r>
       <w:r>
         <w:br/>
@@ -727,7 +727,7 @@
         <w:rPr>
           <w:rStyle w:val="VerbatimChar"/>
         </w:rPr>
-        <w:t xml:space="preserve">## [3,] 0.4794255 0.6816388 0.8414710 0.9489846 0.9974950 0.9839859 0.9092974 0.7780732  0.5984721  0.3816610</w:t>
+        <w:t xml:space="preserve">## [3,] 0.4794255 0.6816388 0.8414710 0.9489846 0.9974950 0.9839859 0.9092974</w:t>
       </w:r>
       <w:r>
         <w:br/>
@@ -736,7 +736,7 @@
         <w:rPr>
           <w:rStyle w:val="VerbatimChar"/>
         </w:rPr>
-        <w:t xml:space="preserve">## [4,] 0.6816388 0.8414710 0.9489846 0.9974950 0.9839859 0.9092974 0.7780732 0.5984721  0.3816610  0.1411200</w:t>
+        <w:t xml:space="preserve">## [4,] 0.6816388 0.8414710 0.9489846 0.9974950 0.9839859 0.9092974 0.7780732</w:t>
       </w:r>
       <w:r>
         <w:br/>
@@ -745,7 +745,7 @@
         <w:rPr>
           <w:rStyle w:val="VerbatimChar"/>
         </w:rPr>
-        <w:t xml:space="preserve">## [5,] 0.8414710 0.9489846 0.9974950 0.9839859 0.9092974 0.7780732 0.5984721 0.3816610  0.1411200 -0.1081951</w:t>
+        <w:t xml:space="preserve">## [5,] 0.8414710 0.9489846 0.9974950 0.9839859 0.9092974 0.7780732 0.5984721</w:t>
       </w:r>
       <w:r>
         <w:br/>
@@ -754,7 +754,70 @@
         <w:rPr>
           <w:rStyle w:val="VerbatimChar"/>
         </w:rPr>
-        <w:t xml:space="preserve">## [6,] 0.9489846 0.9974950 0.9839859 0.9092974 0.7780732 0.5984721 0.3816610 0.1411200 -0.1081951 -0.3507832</w:t>
+        <w:t xml:space="preserve">## [6,] 0.9489846 0.9974950 0.9839859 0.9092974 0.7780732 0.5984721 0.3816610</w:t>
+      </w:r>
+      <w:r>
+        <w:br/>
+      </w:r>
+      <w:r>
+        <w:rPr>
+          <w:rStyle w:val="VerbatimChar"/>
+        </w:rPr>
+        <w:t xml:space="preserve">##             t2         t1         t0</w:t>
+      </w:r>
+      <w:r>
+        <w:br/>
+      </w:r>
+      <w:r>
+        <w:rPr>
+          <w:rStyle w:val="VerbatimChar"/>
+        </w:rPr>
+        <w:t xml:space="preserve">## [1,] 0.9839859  0.9092974  0.7780732</w:t>
+      </w:r>
+      <w:r>
+        <w:br/>
+      </w:r>
+      <w:r>
+        <w:rPr>
+          <w:rStyle w:val="VerbatimChar"/>
+        </w:rPr>
+        <w:t xml:space="preserve">## [2,] 0.9092974  0.7780732  0.5984721</w:t>
+      </w:r>
+      <w:r>
+        <w:br/>
+      </w:r>
+      <w:r>
+        <w:rPr>
+          <w:rStyle w:val="VerbatimChar"/>
+        </w:rPr>
+        <w:t xml:space="preserve">## [3,] 0.7780732  0.5984721  0.3816610</w:t>
+      </w:r>
+      <w:r>
+        <w:br/>
+      </w:r>
+      <w:r>
+        <w:rPr>
+          <w:rStyle w:val="VerbatimChar"/>
+        </w:rPr>
+        <w:t xml:space="preserve">## [4,] 0.5984721  0.3816610  0.1411200</w:t>
+      </w:r>
+      <w:r>
+        <w:br/>
+      </w:r>
+      <w:r>
+        <w:rPr>
+          <w:rStyle w:val="VerbatimChar"/>
+        </w:rPr>
+        <w:t xml:space="preserve">## [5,] 0.3816610  0.1411200 -0.1081951</w:t>
+      </w:r>
+      <w:r>
+        <w:br/>
+      </w:r>
+      <w:r>
+        <w:rPr>
+          <w:rStyle w:val="VerbatimChar"/>
+        </w:rPr>
+        <w:t xml:space="preserve">## [6,] 0.1411200 -0.1081951 -0.3507832</w:t>
       </w:r>
     </w:p>
     <w:p>
@@ -773,19 +836,16 @@
         <w:rPr>
           <w:rStyle w:val="CommentTok"/>
         </w:rPr>
-        <w:t xml:space="preserve"># Plot (original vs augmented windows)</w:t>
-      </w:r>
-      <w:r>
-        <w:br/>
-      </w:r>
-      <w:r>
-        <w:br/>
-      </w:r>
-      <w:r>
-        <w:rPr>
-          <w:rStyle w:val="NormalTok"/>
-        </w:rPr>
-        <w:t xml:space="preserve">i </w:t>
+        <w:t xml:space="preserve"># Plot a few representative windows on the lag axis</w:t>
+      </w:r>
+      <w:r>
+        <w:br/>
+      </w:r>
+      <w:r>
+        <w:rPr>
+          <w:rStyle w:val="NormalTok"/>
+        </w:rPr>
+        <w:t xml:space="preserve">compare_rows </w:t>
       </w:r>
       <w:r>
         <w:rPr>
@@ -801,8 +861,242 @@
       </w:r>
       <w:r>
         <w:rPr>
+          <w:rStyle w:val="FunctionTok"/>
+        </w:rPr>
+        <w:t xml:space="preserve">seq_len</w:t>
+      </w:r>
+      <w:r>
+        <w:rPr>
+          <w:rStyle w:val="NormalTok"/>
+        </w:rPr>
+        <w:t xml:space="preserve">(</w:t>
+      </w:r>
+      <w:r>
+        <w:rPr>
+          <w:rStyle w:val="FunctionTok"/>
+        </w:rPr>
+        <w:t xml:space="preserve">min</w:t>
+      </w:r>
+      <w:r>
+        <w:rPr>
+          <w:rStyle w:val="NormalTok"/>
+        </w:rPr>
+        <w:t xml:space="preserve">(</w:t>
+      </w:r>
+      <w:r>
+        <w:rPr>
+          <w:rStyle w:val="FunctionTok"/>
+        </w:rPr>
+        <w:t xml:space="preserve">nrow</w:t>
+      </w:r>
+      <w:r>
+        <w:rPr>
+          <w:rStyle w:val="NormalTok"/>
+        </w:rPr>
+        <w:t xml:space="preserve">(xa), </w:t>
+      </w:r>
+      <w:r>
+        <w:rPr>
           <w:rStyle w:val="DecValTok"/>
         </w:rPr>
+        <w:t xml:space="preserve">6</w:t>
+      </w:r>
+      <w:r>
+        <w:rPr>
+          <w:rStyle w:val="NormalTok"/>
+        </w:rPr>
+        <w:t xml:space="preserve">))</w:t>
+      </w:r>
+      <w:r>
+        <w:br/>
+      </w:r>
+      <w:r>
+        <w:rPr>
+          <w:rStyle w:val="NormalTok"/>
+        </w:rPr>
+        <w:t xml:space="preserve">comparison </w:t>
+      </w:r>
+      <w:r>
+        <w:rPr>
+          <w:rStyle w:val="OtherTok"/>
+        </w:rPr>
+        <w:t xml:space="preserve">&lt;-</w:t>
+      </w:r>
+      <w:r>
+        <w:rPr>
+          <w:rStyle w:val="NormalTok"/>
+        </w:rPr>
+        <w:t xml:space="preserve"> </w:t>
+      </w:r>
+      <w:r>
+        <w:rPr>
+          <w:rStyle w:val="FunctionTok"/>
+        </w:rPr>
+        <w:t xml:space="preserve">do.call</w:t>
+      </w:r>
+      <w:r>
+        <w:rPr>
+          <w:rStyle w:val="NormalTok"/>
+        </w:rPr>
+        <w:t xml:space="preserve">(</w:t>
+      </w:r>
+      <w:r>
+        <w:br/>
+      </w:r>
+      <w:r>
+        <w:rPr>
+          <w:rStyle w:val="NormalTok"/>
+        </w:rPr>
+        <w:t xml:space="preserve">  rbind,</w:t>
+      </w:r>
+      <w:r>
+        <w:br/>
+      </w:r>
+      <w:r>
+        <w:rPr>
+          <w:rStyle w:val="NormalTok"/>
+        </w:rPr>
+        <w:t xml:space="preserve">  </w:t>
+      </w:r>
+      <w:r>
+        <w:rPr>
+          <w:rStyle w:val="FunctionTok"/>
+        </w:rPr>
+        <w:t xml:space="preserve">lapply</w:t>
+      </w:r>
+      <w:r>
+        <w:rPr>
+          <w:rStyle w:val="NormalTok"/>
+        </w:rPr>
+        <w:t xml:space="preserve">(compare_rows, </w:t>
+      </w:r>
+      <w:r>
+        <w:rPr>
+          <w:rStyle w:val="ControlFlowTok"/>
+        </w:rPr>
+        <w:t xml:space="preserve">function</w:t>
+      </w:r>
+      <w:r>
+        <w:rPr>
+          <w:rStyle w:val="NormalTok"/>
+        </w:rPr>
+        <w:t xml:space="preserve">(row_id) {</w:t>
+      </w:r>
+      <w:r>
+        <w:br/>
+      </w:r>
+      <w:r>
+        <w:rPr>
+          <w:rStyle w:val="NormalTok"/>
+        </w:rPr>
+        <w:t xml:space="preserve">    source_row </w:t>
+      </w:r>
+      <w:r>
+        <w:rPr>
+          <w:rStyle w:val="OtherTok"/>
+        </w:rPr>
+        <w:t xml:space="preserve">&lt;-</w:t>
+      </w:r>
+      <w:r>
+        <w:rPr>
+          <w:rStyle w:val="NormalTok"/>
+        </w:rPr>
+        <w:t xml:space="preserve"> idx[row_id]</w:t>
+      </w:r>
+      <w:r>
+        <w:br/>
+      </w:r>
+      <w:r>
+        <w:rPr>
+          <w:rStyle w:val="NormalTok"/>
+        </w:rPr>
+        <w:t xml:space="preserve">    </w:t>
+      </w:r>
+      <w:r>
+        <w:rPr>
+          <w:rStyle w:val="FunctionTok"/>
+        </w:rPr>
+        <w:t xml:space="preserve">rbind</w:t>
+      </w:r>
+      <w:r>
+        <w:rPr>
+          <w:rStyle w:val="NormalTok"/>
+        </w:rPr>
+        <w:t xml:space="preserve">(</w:t>
+      </w:r>
+      <w:r>
+        <w:br/>
+      </w:r>
+      <w:r>
+        <w:rPr>
+          <w:rStyle w:val="NormalTok"/>
+        </w:rPr>
+        <w:t xml:space="preserve">      </w:t>
+      </w:r>
+      <w:r>
+        <w:rPr>
+          <w:rStyle w:val="FunctionTok"/>
+        </w:rPr>
+        <w:t xml:space="preserve">data.frame</w:t>
+      </w:r>
+      <w:r>
+        <w:rPr>
+          <w:rStyle w:val="NormalTok"/>
+        </w:rPr>
+        <w:t xml:space="preserve">(</w:t>
+      </w:r>
+      <w:r>
+        <w:rPr>
+          <w:rStyle w:val="AttributeTok"/>
+        </w:rPr>
+        <w:t xml:space="preserve">lag =</w:t>
+      </w:r>
+      <w:r>
+        <w:rPr>
+          <w:rStyle w:val="NormalTok"/>
+        </w:rPr>
+        <w:t xml:space="preserve"> </w:t>
+      </w:r>
+      <w:r>
+        <w:rPr>
+          <w:rStyle w:val="FunctionTok"/>
+        </w:rPr>
+        <w:t xml:space="preserve">seq_len</w:t>
+      </w:r>
+      <w:r>
+        <w:rPr>
+          <w:rStyle w:val="NormalTok"/>
+        </w:rPr>
+        <w:t xml:space="preserve">(sw_size), </w:t>
+      </w:r>
+      <w:r>
+        <w:rPr>
+          <w:rStyle w:val="AttributeTok"/>
+        </w:rPr>
+        <w:t xml:space="preserve">value =</w:t>
+      </w:r>
+      <w:r>
+        <w:rPr>
+          <w:rStyle w:val="NormalTok"/>
+        </w:rPr>
+        <w:t xml:space="preserve"> </w:t>
+      </w:r>
+      <w:r>
+        <w:rPr>
+          <w:rStyle w:val="FunctionTok"/>
+        </w:rPr>
+        <w:t xml:space="preserve">as.numeric</w:t>
+      </w:r>
+      <w:r>
+        <w:rPr>
+          <w:rStyle w:val="NormalTok"/>
+        </w:rPr>
+        <w:t xml:space="preserve">(xw[source_row, </w:t>
+      </w:r>
+      <w:r>
+        <w:rPr>
+          <w:rStyle w:val="DecValTok"/>
+        </w:rPr>
         <w:t xml:space="preserve">1</w:t>
       </w:r>
       <w:r>
@@ -813,45 +1107,51 @@
       </w:r>
       <w:r>
         <w:rPr>
-          <w:rStyle w:val="FunctionTok"/>
-        </w:rPr>
-        <w:t xml:space="preserve">nrow</w:t>
-      </w:r>
-      <w:r>
-        <w:rPr>
-          <w:rStyle w:val="NormalTok"/>
-        </w:rPr>
-        <w:t xml:space="preserve">(xw)</w:t>
-      </w:r>
-      <w:r>
-        <w:br/>
-      </w:r>
-      <w:r>
-        <w:rPr>
-          <w:rStyle w:val="NormalTok"/>
-        </w:rPr>
-        <w:t xml:space="preserve">y </w:t>
-      </w:r>
-      <w:r>
-        <w:rPr>
-          <w:rStyle w:val="OtherTok"/>
-        </w:rPr>
-        <w:t xml:space="preserve">&lt;-</w:t>
-      </w:r>
-      <w:r>
-        <w:rPr>
-          <w:rStyle w:val="NormalTok"/>
-        </w:rPr>
-        <w:t xml:space="preserve"> xw[,sw_size]</w:t>
-      </w:r>
-      <w:r>
-        <w:br/>
-      </w:r>
-      <w:r>
-        <w:rPr>
-          <w:rStyle w:val="FunctionTok"/>
-        </w:rPr>
-        <w:t xml:space="preserve">plot</w:t>
+          <w:rStyle w:val="NormalTok"/>
+        </w:rPr>
+        <w:t xml:space="preserve">sw_size]), </w:t>
+      </w:r>
+      <w:r>
+        <w:rPr>
+          <w:rStyle w:val="AttributeTok"/>
+        </w:rPr>
+        <w:t xml:space="preserve">series =</w:t>
+      </w:r>
+      <w:r>
+        <w:rPr>
+          <w:rStyle w:val="NormalTok"/>
+        </w:rPr>
+        <w:t xml:space="preserve"> </w:t>
+      </w:r>
+      <w:r>
+        <w:rPr>
+          <w:rStyle w:val="StringTok"/>
+        </w:rPr>
+        <w:t xml:space="preserve">"original"</w:t>
+      </w:r>
+      <w:r>
+        <w:rPr>
+          <w:rStyle w:val="NormalTok"/>
+        </w:rPr>
+        <w:t xml:space="preserve">, </w:t>
+      </w:r>
+      <w:r>
+        <w:rPr>
+          <w:rStyle w:val="AttributeTok"/>
+        </w:rPr>
+        <w:t xml:space="preserve">sample =</w:t>
+      </w:r>
+      <w:r>
+        <w:rPr>
+          <w:rStyle w:val="NormalTok"/>
+        </w:rPr>
+        <w:t xml:space="preserve"> </w:t>
+      </w:r>
+      <w:r>
+        <w:rPr>
+          <w:rStyle w:val="FunctionTok"/>
+        </w:rPr>
+        <w:t xml:space="preserve">paste</w:t>
       </w:r>
       <w:r>
         <w:rPr>
@@ -861,15 +1161,231 @@
       </w:r>
       <w:r>
         <w:rPr>
+          <w:rStyle w:val="StringTok"/>
+        </w:rPr>
+        <w:t xml:space="preserve">"window"</w:t>
+      </w:r>
+      <w:r>
+        <w:rPr>
+          <w:rStyle w:val="NormalTok"/>
+        </w:rPr>
+        <w:t xml:space="preserve">, source_row)),</w:t>
+      </w:r>
+      <w:r>
+        <w:br/>
+      </w:r>
+      <w:r>
+        <w:rPr>
+          <w:rStyle w:val="NormalTok"/>
+        </w:rPr>
+        <w:t xml:space="preserve">      </w:t>
+      </w:r>
+      <w:r>
+        <w:rPr>
+          <w:rStyle w:val="FunctionTok"/>
+        </w:rPr>
+        <w:t xml:space="preserve">data.frame</w:t>
+      </w:r>
+      <w:r>
+        <w:rPr>
+          <w:rStyle w:val="NormalTok"/>
+        </w:rPr>
+        <w:t xml:space="preserve">(</w:t>
+      </w:r>
+      <w:r>
+        <w:rPr>
           <w:rStyle w:val="AttributeTok"/>
         </w:rPr>
+        <w:t xml:space="preserve">lag =</w:t>
+      </w:r>
+      <w:r>
+        <w:rPr>
+          <w:rStyle w:val="NormalTok"/>
+        </w:rPr>
+        <w:t xml:space="preserve"> </w:t>
+      </w:r>
+      <w:r>
+        <w:rPr>
+          <w:rStyle w:val="FunctionTok"/>
+        </w:rPr>
+        <w:t xml:space="preserve">seq_len</w:t>
+      </w:r>
+      <w:r>
+        <w:rPr>
+          <w:rStyle w:val="NormalTok"/>
+        </w:rPr>
+        <w:t xml:space="preserve">(sw_size), </w:t>
+      </w:r>
+      <w:r>
+        <w:rPr>
+          <w:rStyle w:val="AttributeTok"/>
+        </w:rPr>
+        <w:t xml:space="preserve">value =</w:t>
+      </w:r>
+      <w:r>
+        <w:rPr>
+          <w:rStyle w:val="NormalTok"/>
+        </w:rPr>
+        <w:t xml:space="preserve"> </w:t>
+      </w:r>
+      <w:r>
+        <w:rPr>
+          <w:rStyle w:val="FunctionTok"/>
+        </w:rPr>
+        <w:t xml:space="preserve">as.numeric</w:t>
+      </w:r>
+      <w:r>
+        <w:rPr>
+          <w:rStyle w:val="NormalTok"/>
+        </w:rPr>
+        <w:t xml:space="preserve">(xa[row_id, </w:t>
+      </w:r>
+      <w:r>
+        <w:rPr>
+          <w:rStyle w:val="DecValTok"/>
+        </w:rPr>
+        <w:t xml:space="preserve">1</w:t>
+      </w:r>
+      <w:r>
+        <w:rPr>
+          <w:rStyle w:val="SpecialCharTok"/>
+        </w:rPr>
+        <w:t xml:space="preserve">:</w:t>
+      </w:r>
+      <w:r>
+        <w:rPr>
+          <w:rStyle w:val="NormalTok"/>
+        </w:rPr>
+        <w:t xml:space="preserve">sw_size]), </w:t>
+      </w:r>
+      <w:r>
+        <w:rPr>
+          <w:rStyle w:val="AttributeTok"/>
+        </w:rPr>
+        <w:t xml:space="preserve">series =</w:t>
+      </w:r>
+      <w:r>
+        <w:rPr>
+          <w:rStyle w:val="NormalTok"/>
+        </w:rPr>
+        <w:t xml:space="preserve"> </w:t>
+      </w:r>
+      <w:r>
+        <w:rPr>
+          <w:rStyle w:val="StringTok"/>
+        </w:rPr>
+        <w:t xml:space="preserve">"augmented"</w:t>
+      </w:r>
+      <w:r>
+        <w:rPr>
+          <w:rStyle w:val="NormalTok"/>
+        </w:rPr>
+        <w:t xml:space="preserve">, </w:t>
+      </w:r>
+      <w:r>
+        <w:rPr>
+          <w:rStyle w:val="AttributeTok"/>
+        </w:rPr>
+        <w:t xml:space="preserve">sample =</w:t>
+      </w:r>
+      <w:r>
+        <w:rPr>
+          <w:rStyle w:val="NormalTok"/>
+        </w:rPr>
+        <w:t xml:space="preserve"> </w:t>
+      </w:r>
+      <w:r>
+        <w:rPr>
+          <w:rStyle w:val="FunctionTok"/>
+        </w:rPr>
+        <w:t xml:space="preserve">paste</w:t>
+      </w:r>
+      <w:r>
+        <w:rPr>
+          <w:rStyle w:val="NormalTok"/>
+        </w:rPr>
+        <w:t xml:space="preserve">(</w:t>
+      </w:r>
+      <w:r>
+        <w:rPr>
+          <w:rStyle w:val="StringTok"/>
+        </w:rPr>
+        <w:t xml:space="preserve">"window"</w:t>
+      </w:r>
+      <w:r>
+        <w:rPr>
+          <w:rStyle w:val="NormalTok"/>
+        </w:rPr>
+        <w:t xml:space="preserve">, source_row))</w:t>
+      </w:r>
+      <w:r>
+        <w:br/>
+      </w:r>
+      <w:r>
+        <w:rPr>
+          <w:rStyle w:val="NormalTok"/>
+        </w:rPr>
+        <w:t xml:space="preserve">    )</w:t>
+      </w:r>
+      <w:r>
+        <w:br/>
+      </w:r>
+      <w:r>
+        <w:rPr>
+          <w:rStyle w:val="NormalTok"/>
+        </w:rPr>
+        <w:t xml:space="preserve">  })</w:t>
+      </w:r>
+      <w:r>
+        <w:br/>
+      </w:r>
+      <w:r>
+        <w:rPr>
+          <w:rStyle w:val="NormalTok"/>
+        </w:rPr>
+        <w:t xml:space="preserve">)</w:t>
+      </w:r>
+      <w:r>
+        <w:br/>
+      </w:r>
+      <w:r>
+        <w:br/>
+      </w:r>
+      <w:r>
+        <w:rPr>
+          <w:rStyle w:val="FunctionTok"/>
+        </w:rPr>
+        <w:t xml:space="preserve">ggplot</w:t>
+      </w:r>
+      <w:r>
+        <w:rPr>
+          <w:rStyle w:val="NormalTok"/>
+        </w:rPr>
+        <w:t xml:space="preserve">(comparison, </w:t>
+      </w:r>
+      <w:r>
+        <w:rPr>
+          <w:rStyle w:val="FunctionTok"/>
+        </w:rPr>
+        <w:t xml:space="preserve">aes</w:t>
+      </w:r>
+      <w:r>
+        <w:rPr>
+          <w:rStyle w:val="NormalTok"/>
+        </w:rPr>
+        <w:t xml:space="preserve">(</w:t>
+      </w:r>
+      <w:r>
+        <w:rPr>
+          <w:rStyle w:val="AttributeTok"/>
+        </w:rPr>
         <w:t xml:space="preserve">x =</w:t>
       </w:r>
       <w:r>
         <w:rPr>
           <w:rStyle w:val="NormalTok"/>
         </w:rPr>
-        <w:t xml:space="preserve"> i, </w:t>
+        <w:t xml:space="preserve"> lag, </w:t>
       </w:r>
       <w:r>
         <w:rPr>
@@ -881,13 +1397,64 @@
         <w:rPr>
           <w:rStyle w:val="NormalTok"/>
         </w:rPr>
-        <w:t xml:space="preserve"> y, </w:t>
+        <w:t xml:space="preserve"> value, </w:t>
       </w:r>
       <w:r>
         <w:rPr>
           <w:rStyle w:val="AttributeTok"/>
         </w:rPr>
-        <w:t xml:space="preserve">main =</w:t>
+        <w:t xml:space="preserve">color =</w:t>
+      </w:r>
+      <w:r>
+        <w:rPr>
+          <w:rStyle w:val="NormalTok"/>
+        </w:rPr>
+        <w:t xml:space="preserve"> series, </w:t>
+      </w:r>
+      <w:r>
+        <w:rPr>
+          <w:rStyle w:val="AttributeTok"/>
+        </w:rPr>
+        <w:t xml:space="preserve">group =</w:t>
+      </w:r>
+      <w:r>
+        <w:rPr>
+          <w:rStyle w:val="NormalTok"/>
+        </w:rPr>
+        <w:t xml:space="preserve"> series)) </w:t>
+      </w:r>
+      <w:r>
+        <w:rPr>
+          <w:rStyle w:val="SpecialCharTok"/>
+        </w:rPr>
+        <w:t xml:space="preserve">+</w:t>
+      </w:r>
+      <w:r>
+        <w:br/>
+      </w:r>
+      <w:r>
+        <w:rPr>
+          <w:rStyle w:val="NormalTok"/>
+        </w:rPr>
+        <w:t xml:space="preserve">  </w:t>
+      </w:r>
+      <w:r>
+        <w:rPr>
+          <w:rStyle w:val="FunctionTok"/>
+        </w:rPr>
+        <w:t xml:space="preserve">geom_line</w:t>
+      </w:r>
+      <w:r>
+        <w:rPr>
+          <w:rStyle w:val="NormalTok"/>
+        </w:rPr>
+        <w:t xml:space="preserve">(</w:t>
+      </w:r>
+      <w:r>
+        <w:rPr>
+          <w:rStyle w:val="AttributeTok"/>
+        </w:rPr>
+        <w:t xml:space="preserve">linewidth =</w:t>
       </w:r>
       <w:r>
         <w:rPr>
@@ -897,255 +1464,180 @@
       </w:r>
       <w:r>
         <w:rPr>
-          <w:rStyle w:val="StringTok"/>
-        </w:rPr>
-        <w:t xml:space="preserve">"cosine"</w:t>
+          <w:rStyle w:val="FloatTok"/>
+        </w:rPr>
+        <w:t xml:space="preserve">0.7</w:t>
+      </w:r>
+      <w:r>
+        <w:rPr>
+          <w:rStyle w:val="NormalTok"/>
+        </w:rPr>
+        <w:t xml:space="preserve">) </w:t>
+      </w:r>
+      <w:r>
+        <w:rPr>
+          <w:rStyle w:val="SpecialCharTok"/>
+        </w:rPr>
+        <w:t xml:space="preserve">+</w:t>
+      </w:r>
+      <w:r>
+        <w:br/>
+      </w:r>
+      <w:r>
+        <w:rPr>
+          <w:rStyle w:val="NormalTok"/>
+        </w:rPr>
+        <w:t xml:space="preserve">  </w:t>
+      </w:r>
+      <w:r>
+        <w:rPr>
+          <w:rStyle w:val="FunctionTok"/>
+        </w:rPr>
+        <w:t xml:space="preserve">geom_point</w:t>
+      </w:r>
+      <w:r>
+        <w:rPr>
+          <w:rStyle w:val="NormalTok"/>
+        </w:rPr>
+        <w:t xml:space="preserve">(</w:t>
+      </w:r>
+      <w:r>
+        <w:rPr>
+          <w:rStyle w:val="AttributeTok"/>
+        </w:rPr>
+        <w:t xml:space="preserve">size =</w:t>
+      </w:r>
+      <w:r>
+        <w:rPr>
+          <w:rStyle w:val="NormalTok"/>
+        </w:rPr>
+        <w:t xml:space="preserve"> </w:t>
+      </w:r>
+      <w:r>
+        <w:rPr>
+          <w:rStyle w:val="FloatTok"/>
+        </w:rPr>
+        <w:t xml:space="preserve">1.2</w:t>
+      </w:r>
+      <w:r>
+        <w:rPr>
+          <w:rStyle w:val="NormalTok"/>
+        </w:rPr>
+        <w:t xml:space="preserve">) </w:t>
+      </w:r>
+      <w:r>
+        <w:rPr>
+          <w:rStyle w:val="SpecialCharTok"/>
+        </w:rPr>
+        <w:t xml:space="preserve">+</w:t>
+      </w:r>
+      <w:r>
+        <w:br/>
+      </w:r>
+      <w:r>
+        <w:rPr>
+          <w:rStyle w:val="NormalTok"/>
+        </w:rPr>
+        <w:t xml:space="preserve">  </w:t>
+      </w:r>
+      <w:r>
+        <w:rPr>
+          <w:rStyle w:val="FunctionTok"/>
+        </w:rPr>
+        <w:t xml:space="preserve">facet_wrap</w:t>
+      </w:r>
+      <w:r>
+        <w:rPr>
+          <w:rStyle w:val="NormalTok"/>
+        </w:rPr>
+        <w:t xml:space="preserve">(</w:t>
+      </w:r>
+      <w:r>
+        <w:rPr>
+          <w:rStyle w:val="SpecialCharTok"/>
+        </w:rPr>
+        <w:t xml:space="preserve">~</w:t>
+      </w:r>
+      <w:r>
+        <w:rPr>
+          <w:rStyle w:val="NormalTok"/>
+        </w:rPr>
+        <w:t xml:space="preserve"> sample, </w:t>
+      </w:r>
+      <w:r>
+        <w:rPr>
+          <w:rStyle w:val="AttributeTok"/>
+        </w:rPr>
+        <w:t xml:space="preserve">ncol =</w:t>
+      </w:r>
+      <w:r>
+        <w:rPr>
+          <w:rStyle w:val="NormalTok"/>
+        </w:rPr>
+        <w:t xml:space="preserve"> </w:t>
+      </w:r>
+      <w:r>
+        <w:rPr>
+          <w:rStyle w:val="DecValTok"/>
+        </w:rPr>
+        <w:t xml:space="preserve">3</w:t>
+      </w:r>
+      <w:r>
+        <w:rPr>
+          <w:rStyle w:val="NormalTok"/>
+        </w:rPr>
+        <w:t xml:space="preserve">) </w:t>
+      </w:r>
+      <w:r>
+        <w:rPr>
+          <w:rStyle w:val="SpecialCharTok"/>
+        </w:rPr>
+        <w:t xml:space="preserve">+</w:t>
+      </w:r>
+      <w:r>
+        <w:br/>
+      </w:r>
+      <w:r>
+        <w:rPr>
+          <w:rStyle w:val="NormalTok"/>
+        </w:rPr>
+        <w:t xml:space="preserve">  </w:t>
+      </w:r>
+      <w:r>
+        <w:rPr>
+          <w:rStyle w:val="FunctionTok"/>
+        </w:rPr>
+        <w:t xml:space="preserve">theme_minimal</w:t>
+      </w:r>
+      <w:r>
+        <w:rPr>
+          <w:rStyle w:val="NormalTok"/>
+        </w:rPr>
+        <w:t xml:space="preserve">(</w:t>
+      </w:r>
+      <w:r>
+        <w:rPr>
+          <w:rStyle w:val="AttributeTok"/>
+        </w:rPr>
+        <w:t xml:space="preserve">base_size =</w:t>
+      </w:r>
+      <w:r>
+        <w:rPr>
+          <w:rStyle w:val="NormalTok"/>
+        </w:rPr>
+        <w:t xml:space="preserve"> </w:t>
+      </w:r>
+      <w:r>
+        <w:rPr>
+          <w:rStyle w:val="DecValTok"/>
+        </w:rPr>
+        <w:t xml:space="preserve">14</w:t>
       </w:r>
       <w:r>
         <w:rPr>
           <w:rStyle w:val="NormalTok"/>
         </w:rPr>
         <w:t xml:space="preserve">)</w:t>
-      </w:r>
-      <w:r>
-        <w:br/>
-      </w:r>
-      <w:r>
-        <w:rPr>
-          <w:rStyle w:val="FunctionTok"/>
-        </w:rPr>
-        <w:t xml:space="preserve">lines</w:t>
-      </w:r>
-      <w:r>
-        <w:rPr>
-          <w:rStyle w:val="NormalTok"/>
-        </w:rPr>
-        <w:t xml:space="preserve">(</w:t>
-      </w:r>
-      <w:r>
-        <w:rPr>
-          <w:rStyle w:val="AttributeTok"/>
-        </w:rPr>
-        <w:t xml:space="preserve">x =</w:t>
-      </w:r>
-      <w:r>
-        <w:rPr>
-          <w:rStyle w:val="NormalTok"/>
-        </w:rPr>
-        <w:t xml:space="preserve"> i, </w:t>
-      </w:r>
-      <w:r>
-        <w:rPr>
-          <w:rStyle w:val="AttributeTok"/>
-        </w:rPr>
-        <w:t xml:space="preserve">y =</w:t>
-      </w:r>
-      <w:r>
-        <w:rPr>
-          <w:rStyle w:val="NormalTok"/>
-        </w:rPr>
-        <w:t xml:space="preserve"> y, </w:t>
-      </w:r>
-      <w:r>
-        <w:rPr>
-          <w:rStyle w:val="AttributeTok"/>
-        </w:rPr>
-        <w:t xml:space="preserve">col=</w:t>
-      </w:r>
-      <w:r>
-        <w:rPr>
-          <w:rStyle w:val="StringTok"/>
-        </w:rPr>
-        <w:t xml:space="preserve">"black"</w:t>
-      </w:r>
-      <w:r>
-        <w:rPr>
-          <w:rStyle w:val="NormalTok"/>
-        </w:rPr>
-        <w:t xml:space="preserve">)</w:t>
-      </w:r>
-      <w:r>
-        <w:br/>
-      </w:r>
-      <w:r>
-        <w:rPr>
-          <w:rStyle w:val="ControlFlowTok"/>
-        </w:rPr>
-        <w:t xml:space="preserve">for</w:t>
-      </w:r>
-      <w:r>
-        <w:rPr>
-          <w:rStyle w:val="NormalTok"/>
-        </w:rPr>
-        <w:t xml:space="preserve"> (j </w:t>
-      </w:r>
-      <w:r>
-        <w:rPr>
-          <w:rStyle w:val="ControlFlowTok"/>
-        </w:rPr>
-        <w:t xml:space="preserve">in</w:t>
-      </w:r>
-      <w:r>
-        <w:rPr>
-          <w:rStyle w:val="NormalTok"/>
-        </w:rPr>
-        <w:t xml:space="preserve"> </w:t>
-      </w:r>
-      <w:r>
-        <w:rPr>
-          <w:rStyle w:val="DecValTok"/>
-        </w:rPr>
-        <w:t xml:space="preserve">1</w:t>
-      </w:r>
-      <w:r>
-        <w:rPr>
-          <w:rStyle w:val="SpecialCharTok"/>
-        </w:rPr>
-        <w:t xml:space="preserve">:</w:t>
-      </w:r>
-      <w:r>
-        <w:rPr>
-          <w:rStyle w:val="FunctionTok"/>
-        </w:rPr>
-        <w:t xml:space="preserve">nrow</w:t>
-      </w:r>
-      <w:r>
-        <w:rPr>
-          <w:rStyle w:val="NormalTok"/>
-        </w:rPr>
-        <w:t xml:space="preserve">(xa)) {</w:t>
-      </w:r>
-      <w:r>
-        <w:br/>
-      </w:r>
-      <w:r>
-        <w:rPr>
-          <w:rStyle w:val="NormalTok"/>
-        </w:rPr>
-        <w:t xml:space="preserve">  </w:t>
-      </w:r>
-      <w:r>
-        <w:rPr>
-          <w:rStyle w:val="FunctionTok"/>
-        </w:rPr>
-        <w:t xml:space="preserve">lines</w:t>
-      </w:r>
-      <w:r>
-        <w:rPr>
-          <w:rStyle w:val="NormalTok"/>
-        </w:rPr>
-        <w:t xml:space="preserve">(</w:t>
-      </w:r>
-      <w:r>
-        <w:rPr>
-          <w:rStyle w:val="AttributeTok"/>
-        </w:rPr>
-        <w:t xml:space="preserve">x =</w:t>
-      </w:r>
-      <w:r>
-        <w:rPr>
-          <w:rStyle w:val="NormalTok"/>
-        </w:rPr>
-        <w:t xml:space="preserve"> (idx[j]</w:t>
-      </w:r>
-      <w:r>
-        <w:rPr>
-          <w:rStyle w:val="SpecialCharTok"/>
-        </w:rPr>
-        <w:t xml:space="preserve">-</w:t>
-      </w:r>
-      <w:r>
-        <w:rPr>
-          <w:rStyle w:val="NormalTok"/>
-        </w:rPr>
-        <w:t xml:space="preserve">sw_size</w:t>
-      </w:r>
-      <w:r>
-        <w:rPr>
-          <w:rStyle w:val="SpecialCharTok"/>
-        </w:rPr>
-        <w:t xml:space="preserve">+</w:t>
-      </w:r>
-      <w:r>
-        <w:rPr>
-          <w:rStyle w:val="DecValTok"/>
-        </w:rPr>
-        <w:t xml:space="preserve">1</w:t>
-      </w:r>
-      <w:r>
-        <w:rPr>
-          <w:rStyle w:val="NormalTok"/>
-        </w:rPr>
-        <w:t xml:space="preserve">)</w:t>
-      </w:r>
-      <w:r>
-        <w:rPr>
-          <w:rStyle w:val="SpecialCharTok"/>
-        </w:rPr>
-        <w:t xml:space="preserve">:</w:t>
-      </w:r>
-      <w:r>
-        <w:rPr>
-          <w:rStyle w:val="NormalTok"/>
-        </w:rPr>
-        <w:t xml:space="preserve">idx[j], </w:t>
-      </w:r>
-      <w:r>
-        <w:rPr>
-          <w:rStyle w:val="AttributeTok"/>
-        </w:rPr>
-        <w:t xml:space="preserve">y =</w:t>
-      </w:r>
-      <w:r>
-        <w:rPr>
-          <w:rStyle w:val="NormalTok"/>
-        </w:rPr>
-        <w:t xml:space="preserve"> xa[j,</w:t>
-      </w:r>
-      <w:r>
-        <w:rPr>
-          <w:rStyle w:val="DecValTok"/>
-        </w:rPr>
-        <w:t xml:space="preserve">1</w:t>
-      </w:r>
-      <w:r>
-        <w:rPr>
-          <w:rStyle w:val="SpecialCharTok"/>
-        </w:rPr>
-        <w:t xml:space="preserve">:</w:t>
-      </w:r>
-      <w:r>
-        <w:rPr>
-          <w:rStyle w:val="NormalTok"/>
-        </w:rPr>
-        <w:t xml:space="preserve">sw_size], </w:t>
-      </w:r>
-      <w:r>
-        <w:rPr>
-          <w:rStyle w:val="AttributeTok"/>
-        </w:rPr>
-        <w:t xml:space="preserve">col=</w:t>
-      </w:r>
-      <w:r>
-        <w:rPr>
-          <w:rStyle w:val="StringTok"/>
-        </w:rPr>
-        <w:t xml:space="preserve">"green"</w:t>
-      </w:r>
-      <w:r>
-        <w:rPr>
-          <w:rStyle w:val="NormalTok"/>
-        </w:rPr>
-        <w:t xml:space="preserve">)</w:t>
-      </w:r>
-      <w:r>
-        <w:br/>
-      </w:r>
-      <w:r>
-        <w:rPr>
-          <w:rStyle w:val="NormalTok"/>
-        </w:rPr>
-        <w:t xml:space="preserve">}</w:t>
       </w:r>
     </w:p>
     <w:p>
@@ -1162,7 +1654,7 @@
               <a:graphicData uri="http://schemas.openxmlformats.org/drawingml/2006/picture">
                 <pic:pic>
                   <pic:nvPicPr>
-                    <pic:cNvPr descr="C:\Git\dal\tspredit\examples\augment\doc\01-no-augmentation_files/5c57e47c56729e612b99c8d3ade80ee8433dc498.png" id="14" name="Picture"/>
+                    <pic:cNvPr descr="C:\Git\dal\tspredit\examples\augment\doc\01-no-augmentation_files/7cff4bafb384e8c29161d9f2afab7bf829c58912.png" id="14" name="Picture"/>
                     <pic:cNvPicPr>
                       <a:picLocks noChangeArrowheads="1" noChangeAspect="1"/>
                     </pic:cNvPicPr>

</xml_diff>